<commit_message>
May: teste de correlação
</commit_message>
<xml_diff>
--- a/docs/index.docx
+++ b/docs/index.docx
@@ -667,26 +667,18 @@
       </w:r>
     </w:p>
     <w:bookmarkEnd w:id="28"/>
-    <w:bookmarkStart w:id="29" w:name="statistical-analyses"/>
+    <w:bookmarkStart w:id="29" w:name="análise-de-dados"/>
     <w:p>
       <w:pPr>
         <w:pStyle w:val="Heading2"/>
       </w:pPr>
       <w:r>
-        <w:t xml:space="preserve">5.4 Statistical Analyses</w:t>
+        <w:t xml:space="preserve">5.4 Análise de dados</w:t>
       </w:r>
     </w:p>
     <w:p>
       <w:pPr>
         <w:pStyle w:val="FirstParagraph"/>
-      </w:pPr>
-      <w:r>
-        <w:t xml:space="preserve">Todas as análises estatísticas foram realizadas a partir de duas matrizes de dados: uma matriz ambiental, contendo as variáveis relacionadas à estrutura do habitat e às condições ambientais, e uma matriz comunitária, composta pelos táxons do zooplâncton.</w:t>
-      </w:r>
-    </w:p>
-    <w:p>
-      <w:pPr>
-        <w:pStyle w:val="TextBody"/>
       </w:pPr>
       <w:r>
         <w:t xml:space="preserve">Inicialmente, as variáveis ambientais foram avaliadas quanto à correlação entre si, com o objetivo de identificar variáveis redundantes. As variáveis que apresentaram elevada correlação foram excluídas das análises posteriores, evitando a sobreposição de informações entre os preditores ambientais</w:t>

</xml_diff>